<commit_message>
cardano: add minting tools, proposal, and pitch deck
- Add Cardano/Hydra bridge docs and implementation scaffolding
- Add Mesh native-script NFT collection minter (CIP-25 + timelock)
- Update winery proposal for Cardano route and generate doc/deck artifacts

Co-authored-by: Cursor <cursoragent@cursor.com>
</commit_message>
<xml_diff>
--- a/doc/proposal-wineledger-winery-2026.docx
+++ b/doc/proposal-wineledger-winery-2026.docx
@@ -8,7 +8,7 @@
         <w:jc w:val="left"/>
       </w:pPr>
       <w:r>
-        <w:t>WineLedger — Project Documentation and Winery Proposal</w:t>
+        <w:t>WineLedger — Winery Proposal (Cardano Route)</w:t>
       </w:r>
     </w:p>
     <w:p>
@@ -36,7 +36,7 @@
         <w:t>Date:</w:t>
       </w:r>
       <w:r>
-        <w:t xml:space="preserve"> April 23, 2026</w:t>
+        <w:t xml:space="preserve"> May 7, 2026</w:t>
       </w:r>
     </w:p>
     <w:p>
@@ -484,7 +484,7 @@
         <w:pStyle w:val="Heading2"/>
       </w:pPr>
       <w:r>
-        <w:t>Why we are anchoring the public record on an Ethereum Layer 2</w:t>
+        <w:t>Why we are anchoring the public record on Cardano</w:t>
       </w:r>
     </w:p>
     <w:p>
@@ -492,61 +492,88 @@
         <w:spacing w:after="120"/>
       </w:pPr>
       <w:r>
-        <w:t xml:space="preserve">In our roadmap, the next move is an </w:t>
+        <w:t xml:space="preserve">In our roadmap, the next move is to anchor the WineLedger story to </w:t>
       </w:r>
       <w:r>
         <w:rPr>
           <w:b/>
         </w:rPr>
-        <w:t>EVM</w:t>
-      </w:r>
-      <w:r>
-        <w:t xml:space="preserve">-compatible </w:t>
+        <w:t>Cardano</w:t>
+      </w:r>
+      <w:r>
+        <w:t xml:space="preserve"> in a way that is:</w:t>
+      </w:r>
+    </w:p>
+    <w:p>
+      <w:pPr>
+        <w:spacing w:after="120"/>
+        <w:ind w:left="720" w:hanging="360"/>
+      </w:pPr>
+      <w:r>
+        <w:t xml:space="preserve">•  </w:t>
       </w:r>
       <w:r>
         <w:rPr>
           <w:b/>
         </w:rPr>
-        <w:t>Layer 2 (L2)</w:t>
-      </w:r>
-      <w:r>
-        <w:t xml:space="preserve"> network: a rollup that sits on top of Ethereum, inherits its security model in broad terms, and gives us </w:t>
+        <w:t>Simple to explain:</w:t>
+      </w:r>
+      <w:r>
+        <w:t xml:space="preserve"> the detailed history remains in WineLedger; Cardano holds </w:t>
       </w:r>
       <w:r>
         <w:rPr>
           <w:b/>
         </w:rPr>
-        <w:t>much lower and steadier</w:t>
-      </w:r>
-      <w:r>
-        <w:t xml:space="preserve"> costs for the operations we need—storing a </w:t>
+        <w:t>verifiable public anchors</w:t>
+      </w:r>
+      <w:r>
+        <w:t xml:space="preserve"> and (optionally) </w:t>
       </w:r>
       <w:r>
         <w:rPr>
           <w:b/>
         </w:rPr>
-        <w:t>Merkle root</w:t>
-      </w:r>
-      <w:r>
-        <w:t xml:space="preserve">, a </w:t>
+        <w:t>digital assets</w:t>
+      </w:r>
+      <w:r>
+        <w:t xml:space="preserve"> that point to that history.</w:t>
+      </w:r>
+    </w:p>
+    <w:p>
+      <w:pPr>
+        <w:spacing w:after="120"/>
+        <w:ind w:left="720" w:hanging="360"/>
+      </w:pPr>
+      <w:r>
+        <w:t xml:space="preserve">•  </w:t>
       </w:r>
       <w:r>
         <w:rPr>
           <w:b/>
         </w:rPr>
-        <w:t>commitment to a batch of events</w:t>
-      </w:r>
-      <w:r>
-        <w:t xml:space="preserve">, or a </w:t>
+        <w:t>Cost-aware and sustainable:</w:t>
+      </w:r>
+      <w:r>
+        <w:t xml:space="preserve"> we do not need “one transaction per sensor row.” We batch, anchor at milestones, and use the right on-chain primitive for the job.</w:t>
+      </w:r>
+    </w:p>
+    <w:p>
+      <w:pPr>
+        <w:spacing w:after="120"/>
+        <w:ind w:left="720" w:hanging="360"/>
+      </w:pPr>
+      <w:r>
+        <w:t xml:space="preserve">•  </w:t>
       </w:r>
       <w:r>
         <w:rPr>
           <w:b/>
         </w:rPr>
-        <w:t>pointer</w:t>
-      </w:r>
-      <w:r>
-        <w:t xml:space="preserve"> to a file that holds the full story.</w:t>
+        <w:t>Standards-first:</w:t>
+      </w:r>
+      <w:r>
+        <w:t xml:space="preserve"> we use established Cardano Improvement Proposals (CIPs) so wallets, explorers, and marketplaces can interpret the assets without custom glue.</w:t>
       </w:r>
     </w:p>
     <w:p>
@@ -557,47 +584,6 @@
         <w:rPr>
           <w:b/>
         </w:rPr>
-        <w:t>We are standardizing on Base</w:t>
-      </w:r>
-      <w:r>
-        <w:t xml:space="preserve"> as the L2 for on-chain work. It is an EVM chain we can use with the same tools we already use (including </w:t>
-      </w:r>
-      <w:r>
-        <w:rPr>
-          <w:b/>
-        </w:rPr>
-        <w:t>Solidity</w:t>
-      </w:r>
-      <w:r>
-        <w:t xml:space="preserve">), with fees that stay </w:t>
-      </w:r>
-      <w:r>
-        <w:rPr>
-          <w:b/>
-        </w:rPr>
-        <w:t>practical</w:t>
-      </w:r>
-      <w:r>
-        <w:t xml:space="preserve"> for scheduled anchoring and for optional </w:t>
-      </w:r>
-      <w:r>
-        <w:rPr>
-          <w:b/>
-        </w:rPr>
-        <w:t>NFT</w:t>
-      </w:r>
-      <w:r>
-        <w:t xml:space="preserve"> mints, without asking a winery to pay mainnet prices for day-to-day integrity.</w:t>
-      </w:r>
-    </w:p>
-    <w:p>
-      <w:pPr>
-        <w:spacing w:after="120"/>
-      </w:pPr>
-      <w:r>
-        <w:rPr>
-          <w:b/>
-        </w:rPr>
         <w:t>We want to be clear:</w:t>
       </w:r>
       <w:r>
@@ -610,52 +596,7 @@
         <w:t>not</w:t>
       </w:r>
       <w:r>
-        <w:t xml:space="preserve"> need to post every field-level sensor row on the chain. We will keep the </w:t>
-      </w:r>
-      <w:r>
-        <w:rPr>
-          <w:b/>
-        </w:rPr>
-        <w:t>authoritative, detailed</w:t>
-      </w:r>
-      <w:r>
-        <w:t xml:space="preserve"> history in the WineLedger service and in durable storage; we will use the </w:t>
-      </w:r>
-      <w:r>
-        <w:rPr>
-          <w:b/>
-        </w:rPr>
-        <w:t>L2</w:t>
-      </w:r>
-      <w:r>
-        <w:t xml:space="preserve"> for </w:t>
-      </w:r>
-      <w:r>
-        <w:rPr>
-          <w:b/>
-        </w:rPr>
-        <w:t>verifiable commitments</w:t>
-      </w:r>
-      <w:r>
-        <w:t xml:space="preserve"> (and, if you want them, </w:t>
-      </w:r>
-      <w:r>
-        <w:rPr>
-          <w:b/>
-        </w:rPr>
-        <w:t>ownership</w:t>
-      </w:r>
-      <w:r>
-        <w:t xml:space="preserve"> of digital collectibles) so that a neutral observer can check that a given export or public story matches a </w:t>
-      </w:r>
-      <w:r>
-        <w:rPr>
-          <w:b/>
-        </w:rPr>
-        <w:t>time-stamped</w:t>
-      </w:r>
-      <w:r>
-        <w:t xml:space="preserve"> on-chain record.</w:t>
+        <w:t xml:space="preserve"> need to publish every field-level detail on-chain. The authoritative ledger stays in the WineLedger service and durable storage. Cardano is the public, timestamped, independently verifiable layer that proves “this snapshot existed, then.”</w:t>
       </w:r>
     </w:p>
     <w:p>
@@ -668,7 +609,7 @@
         <w:pStyle w:val="Heading2"/>
       </w:pPr>
       <w:r>
-        <w:t>How we use Solidity on Base (our own smart contracts)</w:t>
+        <w:t>How we use Cardano assets and policies (native scripts + CIPs)</w:t>
       </w:r>
     </w:p>
     <w:p>
@@ -676,31 +617,7 @@
         <w:spacing w:after="120"/>
       </w:pPr>
       <w:r>
-        <w:t xml:space="preserve">We write contracts in </w:t>
-      </w:r>
-      <w:r>
-        <w:rPr>
-          <w:b/>
-        </w:rPr>
-        <w:t>Solidity</w:t>
-      </w:r>
-      <w:r>
-        <w:t xml:space="preserve"> for EVM networks such as Base. We will ship </w:t>
-      </w:r>
-      <w:r>
-        <w:rPr>
-          <w:b/>
-        </w:rPr>
-        <w:t>our own</w:t>
-      </w:r>
-      <w:r>
-        <w:t xml:space="preserve"> small, auditable set of contracts instead of depending on generic third-party dApps for the core story. The design stays easy to explain: </w:t>
-      </w:r>
-      <w:r>
-        <w:rPr>
-          <w:b/>
-        </w:rPr>
-        <w:t>on-chain, we store the “seals” and the “tickets”; off-chain, we store the full book.</w:t>
+        <w:t>Cardano gives us two complementary routes that map cleanly onto wine provenance:</w:t>
       </w:r>
     </w:p>
     <w:p>
@@ -708,79 +625,7 @@
         <w:spacing w:after="120"/>
       </w:pPr>
       <w:r>
-        <w:t xml:space="preserve">We will deploy a </w:t>
-      </w:r>
-      <w:r>
-        <w:rPr>
-          <w:b/>
-        </w:rPr>
-        <w:t>provenance / anchor contract</w:t>
-      </w:r>
-      <w:r>
-        <w:t xml:space="preserve"> in Solidity to record </w:t>
-      </w:r>
-      <w:r>
-        <w:rPr>
-          <w:b/>
-        </w:rPr>
-        <w:t>commitments</w:t>
-      </w:r>
-      <w:r>
-        <w:t xml:space="preserve"> from the running service—for example, the root hash of a </w:t>
-      </w:r>
-      <w:r>
-        <w:rPr>
-          <w:b/>
-        </w:rPr>
-        <w:t>Merkle tree</w:t>
-      </w:r>
-      <w:r>
-        <w:t xml:space="preserve"> over a batch of events, or a hash of a </w:t>
-      </w:r>
-      <w:r>
-        <w:rPr>
-          <w:b/>
-        </w:rPr>
-        <w:t>snapshot</w:t>
-      </w:r>
-      <w:r>
-        <w:t xml:space="preserve"> file in the cloud. Each commit is </w:t>
-      </w:r>
-      <w:r>
-        <w:rPr>
-          <w:b/>
-        </w:rPr>
-        <w:t>one</w:t>
-      </w:r>
-      <w:r>
-        <w:t xml:space="preserve"> L2 transaction per batch (or per milestone we agree on with you), not one transaction per line item. The contract will emit </w:t>
-      </w:r>
-      <w:r>
-        <w:rPr>
-          <w:b/>
-        </w:rPr>
-        <w:t>events</w:t>
-      </w:r>
-      <w:r>
-        <w:t xml:space="preserve"> (log lines that indexers and explorers read) so that you, your partners, or the public can see </w:t>
-      </w:r>
-      <w:r>
-        <w:rPr>
-          <w:b/>
-        </w:rPr>
-        <w:t>when</w:t>
-      </w:r>
-      <w:r>
-        <w:t xml:space="preserve"> a new batch was sealed and </w:t>
-      </w:r>
-      <w:r>
-        <w:rPr>
-          <w:b/>
-        </w:rPr>
-        <w:t>link</w:t>
-      </w:r>
-      <w:r>
-        <w:t xml:space="preserve"> that seal to the off-line data we publish for you.</w:t>
+        <w:t>### Route A — Collectible / campaign NFTs (CIP-25, native scripts)</w:t>
       </w:r>
     </w:p>
     <w:p>
@@ -788,97 +633,147 @@
         <w:spacing w:after="120"/>
       </w:pPr>
       <w:r>
-        <w:t xml:space="preserve">For </w:t>
+        <w:t xml:space="preserve">For limited campaigns (a vintage release, a route, a tasting event), we mint NFTs using </w:t>
       </w:r>
       <w:r>
         <w:rPr>
           <w:b/>
         </w:rPr>
-        <w:t>optional</w:t>
-      </w:r>
-      <w:r>
-        <w:t xml:space="preserve"> campaigns—limited art tied to a vintage or a route—we can deploy a separate </w:t>
+        <w:t>Cardano native scripts</w:t>
+      </w:r>
+      <w:r>
+        <w:t xml:space="preserve"> (no smart contracts) with </w:t>
       </w:r>
       <w:r>
         <w:rPr>
           <w:b/>
         </w:rPr>
-        <w:t>ERC-721</w:t>
-      </w:r>
-      <w:r>
-        <w:t xml:space="preserve">-style </w:t>
+        <w:t>CIP-25</w:t>
+      </w:r>
+      <w:r>
+        <w:t xml:space="preserve"> metadata for marketplace compatibility. This is deliberately simple and economical:</w:t>
+      </w:r>
+    </w:p>
+    <w:p>
+      <w:pPr>
+        <w:spacing w:after="120"/>
+        <w:ind w:left="720" w:hanging="360"/>
+      </w:pPr>
+      <w:r>
+        <w:t xml:space="preserve">•  </w:t>
+      </w:r>
+      <w:r>
+        <w:t xml:space="preserve">A </w:t>
       </w:r>
       <w:r>
         <w:rPr>
           <w:b/>
         </w:rPr>
-        <w:t>NFT</w:t>
-      </w:r>
-      <w:r>
-        <w:t xml:space="preserve"> contract in Solidity to mint </w:t>
+        <w:t>minting policy</w:t>
+      </w:r>
+      <w:r>
+        <w:t xml:space="preserve"> is a small script that can require a signature and can be </w:t>
       </w:r>
       <w:r>
         <w:rPr>
           <w:b/>
         </w:rPr>
-        <w:t>collectibles</w:t>
-      </w:r>
-      <w:r>
-        <w:t xml:space="preserve"> on Base, with </w:t>
+        <w:t>time-locked</w:t>
+      </w:r>
+      <w:r>
+        <w:t xml:space="preserve"> (expires after a chosen slot).</w:t>
+      </w:r>
+    </w:p>
+    <w:p>
+      <w:pPr>
+        <w:spacing w:after="120"/>
+        <w:ind w:left="720" w:hanging="360"/>
+      </w:pPr>
+      <w:r>
+        <w:t xml:space="preserve">•  </w:t>
+      </w:r>
+      <w:r>
+        <w:t xml:space="preserve">We can mint </w:t>
       </w:r>
       <w:r>
         <w:rPr>
           <w:b/>
         </w:rPr>
-        <w:t>metadata</w:t>
-      </w:r>
-      <w:r>
-        <w:t xml:space="preserve"> that points to A.I.-generated or generative art and, where appropriate, back to the same </w:t>
+        <w:t>multiple NFTs in one transaction</w:t>
+      </w:r>
+      <w:r>
+        <w:t>.</w:t>
+      </w:r>
+    </w:p>
+    <w:p>
+      <w:pPr>
+        <w:spacing w:after="120"/>
+        <w:ind w:left="720" w:hanging="360"/>
+      </w:pPr>
+      <w:r>
+        <w:t xml:space="preserve">•  </w:t>
+      </w:r>
+      <w:r>
+        <w:t xml:space="preserve">Metadata is attached under label </w:t>
       </w:r>
       <w:r>
         <w:rPr>
           <w:b/>
         </w:rPr>
-        <w:t>commitment</w:t>
-      </w:r>
-      <w:r>
-        <w:t xml:space="preserve"> or bottle identifier. We can encode </w:t>
+        <w:t>721</w:t>
+      </w:r>
+      <w:r>
+        <w:t xml:space="preserve"> following the CIP-25 structure wallets and marketplaces expect.</w:t>
+      </w:r>
+    </w:p>
+    <w:p>
+      <w:pPr>
+        <w:spacing w:after="120"/>
+      </w:pPr>
+      <w:r>
+        <w:t>This is the “collectible layer”: art plus a trustworthy pointer to the WineLedger narrative.</w:t>
+      </w:r>
+    </w:p>
+    <w:p>
+      <w:pPr>
+        <w:spacing w:after="120"/>
+      </w:pPr>
+      <w:r>
+        <w:t>### Route B — Long-lived bottle / batch identity (CIP-68 + optional Hydra)</w:t>
+      </w:r>
+    </w:p>
+    <w:p>
+      <w:pPr>
+        <w:spacing w:after="120"/>
+      </w:pPr>
+      <w:r>
+        <w:t xml:space="preserve">For operational provenance (the living identity of a bottle or batch that changes over time), we use </w:t>
       </w:r>
       <w:r>
         <w:rPr>
           <w:b/>
         </w:rPr>
-        <w:t>royalties and allowlists</w:t>
-      </w:r>
-      <w:r>
-        <w:t xml:space="preserve"> in the contract layer so you keep control of how tokens are used in marketplaces. None of this replaces the need for a sound legal and brand policy, but we can give you a </w:t>
+        <w:t>CIP-68</w:t>
+      </w:r>
+      <w:r>
+        <w:t>: a stable reference asset plus an updatable “standard” representation that can carry structured state.</w:t>
+      </w:r>
+    </w:p>
+    <w:p>
+      <w:pPr>
+        <w:spacing w:after="120"/>
+      </w:pPr>
+      <w:r>
+        <w:t xml:space="preserve">When update frequency is high (logistics scans, sensor-style updates), we can scale by running updates through a </w:t>
       </w:r>
       <w:r>
         <w:rPr>
           <w:b/>
         </w:rPr>
-        <w:t>clean technical</w:t>
-      </w:r>
-      <w:r>
-        <w:t xml:space="preserve"> story: the chain holds </w:t>
-      </w:r>
-      <w:r>
-        <w:rPr>
-          <w:b/>
-        </w:rPr>
-        <w:t>hashes, pointers, and ownership</w:t>
-      </w:r>
-      <w:r>
-        <w:t xml:space="preserve">; you hold </w:t>
-      </w:r>
-      <w:r>
-        <w:rPr>
-          <w:b/>
-        </w:rPr>
-        <w:t>narrative and law</w:t>
-      </w:r>
-      <w:r>
-        <w:t>.</w:t>
+        <w:t>Cardano Hydra head</w:t>
+      </w:r>
+      <w:r>
+        <w:t xml:space="preserve"> (Layer-2 state channel), then settling to L1 at agreed milestones. The result is a credible story for both engineers and stakeholders: frequent low-cost updates when needed, and periodic public settlement for audit.</w:t>
       </w:r>
     </w:p>
     <w:p>
@@ -891,7 +786,7 @@
         <w:pStyle w:val="Heading2"/>
       </w:pPr>
       <w:r>
-        <w:t>Phase B — The plan: production on AWS and live anchoring to Base</w:t>
+        <w:t>Phase B — The plan: production on AWS and live anchoring to Cardano</w:t>
       </w:r>
     </w:p>
     <w:p>
@@ -920,19 +815,10 @@
         <w:rPr>
           <w:b/>
         </w:rPr>
-        <w:t>Base</w:t>
-      </w:r>
-      <w:r>
-        <w:t xml:space="preserve"> with </w:t>
-      </w:r>
-      <w:r>
-        <w:rPr>
-          <w:b/>
-        </w:rPr>
-        <w:t>our</w:t>
-      </w:r>
-      <w:r>
-        <w:t xml:space="preserve"> custom Solidity contracts so that integrity is not only “inside our server” but can be </w:t>
+        <w:t>Cardano</w:t>
+      </w:r>
+      <w:r>
+        <w:t xml:space="preserve"> so that integrity is not only “inside our server” but can be </w:t>
       </w:r>
       <w:r>
         <w:rPr>
@@ -941,7 +827,7 @@
         <w:t>checked from outside</w:t>
       </w:r>
       <w:r>
-        <w:t xml:space="preserve"> using public tools and standard wallets. </w:t>
+        <w:t xml:space="preserve"> using public tools and standard wallets/explorers. </w:t>
       </w:r>
       <w:r>
         <w:rPr>
@@ -1138,64 +1024,19 @@
         <w:rPr>
           <w:b/>
         </w:rPr>
-        <w:t>relayer</w:t>
-      </w:r>
-      <w:r>
-        <w:t xml:space="preserve"> process (a small, audited service) that </w:t>
+        <w:t>transaction builder + submitter</w:t>
+      </w:r>
+      <w:r>
+        <w:t xml:space="preserve"> service (kept isolated from the public internet) that signs and submits Cardano transactions for anchoring. In Phase B this focuses on the operational identity path (CIP-68-shaped state) and on publishing </w:t>
       </w:r>
       <w:r>
         <w:rPr>
           <w:b/>
         </w:rPr>
-        <w:t>only</w:t>
-      </w:r>
-      <w:r>
-        <w:t xml:space="preserve"> our deployment can use to post </w:t>
-      </w:r>
-      <w:r>
-        <w:rPr>
-          <w:b/>
-        </w:rPr>
-        <w:t>Merkle roots</w:t>
-      </w:r>
-      <w:r>
-        <w:t xml:space="preserve"> or file hashes to our </w:t>
-      </w:r>
-      <w:r>
-        <w:rPr>
-          <w:b/>
-        </w:rPr>
-        <w:t>provenance</w:t>
-      </w:r>
-      <w:r>
-        <w:t xml:space="preserve"> Solidity contract on </w:t>
-      </w:r>
-      <w:r>
-        <w:rPr>
-          <w:b/>
-        </w:rPr>
-        <w:t>Base</w:t>
-      </w:r>
-      <w:r>
-        <w:t xml:space="preserve"> on a </w:t>
-      </w:r>
-      <w:r>
-        <w:rPr>
-          <w:b/>
-        </w:rPr>
-        <w:t>fixed schedule</w:t>
-      </w:r>
-      <w:r>
-        <w:t xml:space="preserve"> or at </w:t>
-      </w:r>
-      <w:r>
-        <w:rPr>
-          <w:b/>
-        </w:rPr>
-        <w:t>business milestones</w:t>
-      </w:r>
-      <w:r>
-        <w:t xml:space="preserve"> (for example, “lot bottled,” “pallet shipped”).</w:t>
+        <w:t>hash-linked snapshot commitments</w:t>
+      </w:r>
+      <w:r>
+        <w:t xml:space="preserve"> that independent parties can verify against exported data.</w:t>
       </w:r>
     </w:p>
     <w:p>
@@ -1330,16 +1171,7 @@
         <w:t>point</w:t>
       </w:r>
       <w:r>
-        <w:t xml:space="preserve"> to a </w:t>
-      </w:r>
-      <w:r>
-        <w:rPr>
-          <w:b/>
-        </w:rPr>
-        <w:t>Base</w:t>
-      </w:r>
-      <w:r>
-        <w:t xml:space="preserve"> address where independent parties verify that the batches we publish for you match on-chain commitments.</w:t>
+        <w:t xml:space="preserve"> to Cardano transactions/assets where independent parties verify that the batches we publish for you match on-chain commitments.</w:t>
       </w:r>
     </w:p>
     <w:p>
@@ -1366,7 +1198,7 @@
         <w:t>Our goal in Phase C</w:t>
       </w:r>
       <w:r>
-        <w:t xml:space="preserve"> is to turn the data and commits from Phase B into a </w:t>
+        <w:t xml:space="preserve"> is to turn the data and anchors from Phase B into a </w:t>
       </w:r>
       <w:r>
         <w:rPr>
@@ -1390,7 +1222,7 @@
         <w:rPr>
           <w:b/>
         </w:rPr>
-        <w:t>Base</w:t>
+        <w:t>Cardano</w:t>
       </w:r>
       <w:r>
         <w:t xml:space="preserve"> holds </w:t>
@@ -1539,16 +1371,7 @@
         <w:t>content hash</w:t>
       </w:r>
       <w:r>
-        <w:t xml:space="preserve">; we will make </w:t>
-      </w:r>
-      <w:r>
-        <w:rPr>
-          <w:b/>
-        </w:rPr>
-        <w:t>metadata</w:t>
-      </w:r>
-      <w:r>
-        <w:t xml:space="preserve"> reference the </w:t>
+        <w:t xml:space="preserve">; we will make metadata reference the </w:t>
       </w:r>
       <w:r>
         <w:rPr>
@@ -1563,19 +1386,10 @@
         <w:rPr>
           <w:b/>
         </w:rPr>
-        <w:t>Merkle root</w:t>
-      </w:r>
-      <w:r>
-        <w:t xml:space="preserve"> or anchor already on </w:t>
-      </w:r>
-      <w:r>
-        <w:rPr>
-          <w:b/>
-        </w:rPr>
-        <w:t>Base</w:t>
-      </w:r>
-      <w:r>
-        <w:t xml:space="preserve">. We will work with you on </w:t>
+        <w:t>Cardano anchor</w:t>
+      </w:r>
+      <w:r>
+        <w:t xml:space="preserve"> for the corresponding snapshot. We will work with you on </w:t>
       </w:r>
       <w:r>
         <w:rPr>
@@ -1608,7 +1422,7 @@
         <w:rPr>
           <w:b/>
         </w:rPr>
-        <w:t>NFT program (on Base, via our Solidity):</w:t>
+        <w:t>NFT program (on Cardano, native scripts + CIP-25):</w:t>
       </w:r>
       <w:r>
         <w:t xml:space="preserve"> if you want a </w:t>
@@ -1620,70 +1434,16 @@
         <w:t>collectible</w:t>
       </w:r>
       <w:r>
-        <w:t xml:space="preserve"> program, we will use the same L2 for </w:t>
+        <w:t xml:space="preserve"> program, we mint under a time-locked, signature-based native policy (simple, auditable) with </w:t>
       </w:r>
       <w:r>
         <w:rPr>
           <w:b/>
         </w:rPr>
-        <w:t>minting</w:t>
-      </w:r>
-      <w:r>
-        <w:t xml:space="preserve"> so fees stay low, with </w:t>
-      </w:r>
-      <w:r>
-        <w:rPr>
-          <w:b/>
-        </w:rPr>
-        <w:t>clear</w:t>
-      </w:r>
-      <w:r>
-        <w:t xml:space="preserve"> links between </w:t>
-      </w:r>
-      <w:r>
-        <w:rPr>
-          <w:b/>
-        </w:rPr>
-        <w:t>token</w:t>
-      </w:r>
-      <w:r>
-        <w:t xml:space="preserve">, </w:t>
-      </w:r>
-      <w:r>
-        <w:rPr>
-          <w:b/>
-        </w:rPr>
-        <w:t>art</w:t>
-      </w:r>
-      <w:r>
-        <w:t xml:space="preserve">, and the </w:t>
-      </w:r>
-      <w:r>
-        <w:rPr>
-          <w:b/>
-        </w:rPr>
-        <w:t>provenance</w:t>
-      </w:r>
-      <w:r>
-        <w:t xml:space="preserve"> commitment. We will keep the </w:t>
-      </w:r>
-      <w:r>
-        <w:rPr>
-          <w:b/>
-        </w:rPr>
-        <w:t>on-chain</w:t>
-      </w:r>
-      <w:r>
-        <w:t xml:space="preserve"> part small; we will point the </w:t>
-      </w:r>
-      <w:r>
-        <w:rPr>
-          <w:b/>
-        </w:rPr>
-        <w:t>art file</w:t>
-      </w:r>
-      <w:r>
-        <w:t xml:space="preserve"> with a </w:t>
+        <w:t>CIP-25</w:t>
+      </w:r>
+      <w:r>
+        <w:t xml:space="preserve"> metadata for marketplace compatibility. We keep the on-chain footprint small; we point the art file with a </w:t>
       </w:r>
       <w:r>
         <w:rPr>
@@ -1917,19 +1677,10 @@
         <w:rPr>
           <w:b/>
         </w:rPr>
-        <w:t>Base</w:t>
-      </w:r>
-      <w:r>
-        <w:t xml:space="preserve"> with </w:t>
-      </w:r>
-      <w:r>
-        <w:rPr>
-          <w:b/>
-        </w:rPr>
-        <w:t>our</w:t>
-      </w:r>
-      <w:r>
-        <w:t xml:space="preserve"> Solidity contracts, deployed from </w:t>
+        <w:t>Cardano</w:t>
+      </w:r>
+      <w:r>
+        <w:t xml:space="preserve">, deployed from </w:t>
       </w:r>
       <w:r>
         <w:rPr>

</xml_diff>